<commit_message>
Fix mathematical equation formatting in DOCX and Markdown
</commit_message>
<xml_diff>
--- a/research/proposals/proposal_for_professor.docx
+++ b/research/proposals/proposal_for_professor.docx
@@ -752,45 +752,28 @@
       </w:r>
     </w:p>
     <w:p>
+      <w:pPr>
+        <w:spacing w:before="160" w:after="160"/>
+        <w:ind w:left="720" w:right="720"/>
+        <w:jc w:val="center"/>
+        <w:pBdr>
+          <w:top w:val="single" w:sz="4" w:space="4" w:color="E0E0E0"/>
+          <w:bottom w:val="single" w:sz="4" w:space="4" w:color="E0E0E0"/>
+        </w:pBdr>
+      </w:pPr>
       <w:r>
         <w:rPr>
-          <w:i/>
-          <w:color w:val="555555"/>
+          <w:rFonts w:ascii="Cambria Math" w:hAnsi="Cambria Math"/>
+          <w:b/>
+          <w:color w:val="1B365D"/>
+          <w:sz w:val="24"/>
         </w:rPr>
-      </w:r>
-      <w:r>
-        <w:t>\mathbf{M}_d \ddot{\tilde{\mathbf{x}}} + \mathbf{D}_d^{(q)} \dot{\tilde{\mathbf{x}}} + \mathbf{K}_d^{(q)} \tilde{\mathbf{x}} = \mathbf{F}_{ext}</w:t>
-      </w:r>
-      <w:r>
-        <w:rPr>
-          <w:i/>
-          <w:color w:val="555555"/>
-        </w:rPr>
+        <w:t>M_d · ẍ_tilde + D_d(q) · ẋ_tilde + K_d(q) · x_tilde = F_ext</w:t>
       </w:r>
     </w:p>
     <w:p>
       <w:r>
-        <w:t xml:space="preserve">where </w:t>
-      </w:r>
-      <w:r>
-        <w:rPr>
-          <w:i/>
-          <w:color w:val="555555"/>
-        </w:rPr>
-        <w:t>q \in \{1, 2, 3, 4\}</w:t>
-      </w:r>
-      <w:r>
-        <w:t xml:space="preserve"> denotes the active phase, and </w:t>
-      </w:r>
-      <w:r>
-        <w:rPr>
-          <w:i/>
-          <w:color w:val="555555"/>
-        </w:rPr>
-        <w:t>\tilde{\mathbf{x}} = \mathbf{x} - \mathbf{x}_d</w:t>
-      </w:r>
-      <w:r>
-        <w:t xml:space="preserve"> represents deviation from the planned path.</w:t>
+        <w:t>where q in {1, 2, 3, 4} denotes the active phase, and x_tilde = x - x_d represents deviation from the planned path.</w:t>
       </w:r>
     </w:p>
     <w:p>

</xml_diff>

<commit_message>
Add ADEPT paper survey and open-source foundation models as future work roadmap
</commit_message>
<xml_diff>
--- a/research/proposals/proposal_for_professor.docx
+++ b/research/proposals/proposal_for_professor.docx
@@ -1992,6 +1992,152 @@
     </w:p>
     <w:p>
       <w:pPr>
+        <w:keepNext/>
+        <w:spacing w:before="200" w:after="80"/>
+      </w:pPr>
+      <w:r>
+        <w:rPr>
+          <w:rFonts w:ascii="Calibri" w:hAnsi="Calibri"/>
+          <w:b/>
+          <w:color w:val="4B6B94"/>
+          <w:sz w:val="26"/>
+        </w:rPr>
+        <w:t>8.3 Future Work: Toward Foundation Models &amp; A Unified Manipulation Skill Library</w:t>
+      </w:r>
+    </w:p>
+    <w:p>
+      <w:r>
+        <w:t xml:space="preserve">Looking beyond specialized cutting controllers, this research establishes the foundational sensory and motor primitives for culinary tool use that can be integrated into broader </w:t>
+      </w:r>
+      <w:r>
+        <w:rPr>
+          <w:b/>
+        </w:rPr>
+        <w:t>Embodied AI Foundation Models</w:t>
+      </w:r>
+      <w:r>
+        <w:t>:</w:t>
+      </w:r>
+    </w:p>
+    <w:p>
+      <w:pPr>
+        <w:pStyle w:val="ListBullet"/>
+        <w:spacing w:after="60"/>
+      </w:pPr>
+      <w:r>
+        <w:rPr>
+          <w:b/>
+        </w:rPr>
+        <w:t>Pre-Trained Skill Libraries (ADEPT Paradigm)</w:t>
+      </w:r>
+      <w:r>
+        <w:t xml:space="preserve">: Drawing from recent breakthroughs in dexterous pre-training such as </w:t>
+      </w:r>
+      <w:r>
+        <w:rPr>
+          <w:b/>
+        </w:rPr>
+        <w:t>ADEPT</w:t>
+      </w:r>
+      <w:r>
+        <w:t xml:space="preserve"> (Lee et al., CoRL 2026), our cutting dynamics and impedance controllers can be encapsulated as reusable motor priors. Instead of training food preparation behaviors from scratch, downstream applications can post-train on top of these verified contact-rich skills.</w:t>
+      </w:r>
+    </w:p>
+    <w:p>
+      <w:pPr>
+        <w:pStyle w:val="ListBullet"/>
+        <w:spacing w:after="60"/>
+      </w:pPr>
+      <w:r>
+        <w:rPr>
+          <w:b/>
+        </w:rPr>
+        <w:t>Open-Source Model Integration</w:t>
+      </w:r>
+      <w:r>
+        <w:t xml:space="preserve">: Experimental cutting trajectories and multi-modal contact data will be structured to interface with open-source foundation platforms—including </w:t>
+      </w:r>
+      <w:r>
+        <w:rPr>
+          <w:b/>
+        </w:rPr>
+        <w:t>Hugging Face LeRobot</w:t>
+      </w:r>
+      <w:r>
+        <w:t xml:space="preserve">, </w:t>
+      </w:r>
+      <w:r>
+        <w:rPr>
+          <w:b/>
+        </w:rPr>
+        <w:t>Octo (Open X-Embodiment)</w:t>
+      </w:r>
+      <w:r>
+        <w:t xml:space="preserve">, and </w:t>
+      </w:r>
+      <w:r>
+        <w:rPr>
+          <w:b/>
+        </w:rPr>
+        <w:t>OpenVLA</w:t>
+      </w:r>
+      <w:r>
+        <w:t>. This connects specialized cutting mechanics to generalized language-conditioned manipulation (</w:t>
+      </w:r>
+      <w:r>
+        <w:rPr>
+          <w:i/>
+        </w:rPr>
+        <w:t>"slice the tomato into 5mm rings"</w:t>
+      </w:r>
+      <w:r>
+        <w:t>).</w:t>
+      </w:r>
+    </w:p>
+    <w:p>
+      <w:pPr>
+        <w:pStyle w:val="ListBullet"/>
+        <w:spacing w:after="60"/>
+      </w:pPr>
+      <w:r>
+        <w:rPr>
+          <w:b/>
+        </w:rPr>
+        <w:t>Unified Robot Operating Infrastructure</w:t>
+      </w:r>
+      <w:r>
+        <w:t>: In synergy with the laboratory's ongoing work on hardware-agnostic teleoperation (</w:t>
+      </w:r>
+      <w:r>
+        <w:rPr>
+          <w:i/>
+        </w:rPr>
+        <w:t>Open TeleDex</w:t>
+      </w:r>
+      <w:r>
+        <w:t xml:space="preserve">) and emerging unified OS initiatives (e.g., </w:t>
+      </w:r>
+      <w:r>
+        <w:rPr>
+          <w:i/>
+        </w:rPr>
+        <w:t>OpenMind OM1</w:t>
+      </w:r>
+      <w:r>
+        <w:t xml:space="preserve"> and </w:t>
+      </w:r>
+      <w:r>
+        <w:rPr>
+          <w:i/>
+        </w:rPr>
+        <w:t>NVIDIA Isaac Lab</w:t>
+      </w:r>
+      <w:r>
+        <w:t>), these manipulation skills can be retargeted seamlessly across diverse robotic embodiments, from tabletop single-arm manipulators to dual-arm humanoid platforms (DexCatch).</w:t>
+      </w:r>
+    </w:p>
+    <w:p>
+      <w:pPr>
         <w:spacing w:before="120" w:after="120"/>
         <w:pBdr>
           <w:bottom w:val="single" w:sz="6" w:space="1" w:color="CCCCCC"/>

</xml_diff>

<commit_message>
Add ADEPT PDF, resources index, and two-paper research strategy (Paper 1: Traditional RL/Tomatoes, Paper 2: ADEPT paradigm)
</commit_message>
<xml_diff>
--- a/research/proposals/proposal_for_professor.docx
+++ b/research/proposals/proposal_for_professor.docx
@@ -1353,6 +1353,11 @@
         <w:t>6. Publication Plan</w:t>
       </w:r>
     </w:p>
+    <w:p>
+      <w:r>
+        <w:t>The research is structured around a two-stage publication strategy advancing from baseline physical mechanics to scalable foundation-model adaptation:</w:t>
+      </w:r>
+    </w:p>
     <w:tbl>
       <w:tblPr>
         <w:tblW w:type="auto" w:w="0"/>
@@ -1459,7 +1464,7 @@
                 <w:b/>
                 <w:color w:val="FFFFFF"/>
               </w:rPr>
-              <w:t>Focus</w:t>
+              <w:t>Core Focus &amp; Methodology</w:t>
             </w:r>
           </w:p>
         </w:tc>
@@ -1485,7 +1490,7 @@
               <w:rPr>
                 <w:b/>
               </w:rPr>
-              <w:t>IEEE RA-L / IROS 2028</w:t>
+              <w:t>Paper 1: IEEE RA-L / IROS 2028</w:t>
             </w:r>
           </w:p>
         </w:tc>
@@ -1527,7 +1532,13 @@
             </w:pPr>
             <w:r/>
             <w:r>
-              <w:t>Core system design, on-tool sensing, phase-aware control, and preliminary benchmarks.</w:t>
+              <w:rPr>
+                <w:b/>
+              </w:rPr>
+              <w:t>Adaptive Slicing of Deformable Objects via Traditional RL &amp; Phase-Aware Impedance Control</w:t>
+            </w:r>
+            <w:r>
+              <w:t>&lt;br&gt;Focuses on on-tool sensing (TacBlade), fracture transition mechanics, hybrid vision-force control, and baseline reinforcement learning benchmarks on soft deformable produce (tomatoes).</w:t>
             </w:r>
           </w:p>
         </w:tc>
@@ -1553,7 +1564,7 @@
               <w:rPr>
                 <w:b/>
               </w:rPr>
-              <w:t>IEEE ICRA / T-RO 2029</w:t>
+              <w:t>Paper 2: IEEE ICRA / T-RO 2029</w:t>
             </w:r>
           </w:p>
         </w:tc>
@@ -1595,7 +1606,13 @@
             </w:pPr>
             <w:r/>
             <w:r>
-              <w:t>Advanced multi-food generalization, vision-tactile integration, stability proofs, and comprehensive experimental dataset.</w:t>
+              <w:rPr>
+                <w:b/>
+              </w:rPr>
+              <w:t>Scaling Deformable Manipulation via Pre-Trained Foundation Dexterity (The ADEPT Approach)</w:t>
+            </w:r>
+            <w:r>
+              <w:t>&lt;br&gt;Applies the ADEPT paradigm (pre-training foundational manipulation priors in Isaac Lab, structured post-training with BC distillation and critic warm-up to prevent policy collapse, full-joint geometric fabrics, and visuo-tactile student distillation) to achieve zero-shot generalized slicing across heterogeneous foods.</w:t>
             </w:r>
           </w:p>
         </w:tc>
@@ -1623,7 +1640,7 @@
     </w:p>
     <w:p>
       <w:r>
-        <w:t>This work sits at the intersection of contact-rich manipulation, tactile and force sensing, and compliant robot control, all of which are core topics at IROS and ICRA. Combining an explicit physical mechanics formulation with embedded hardware implementation and practical food robotics benchmarks provides a balanced, publishable submission.</w:t>
+        <w:t>This work sits at the intersection of contact-rich manipulation, tactile and force sensing, and compliant robot control, all of which are core topics at IROS and ICRA. Combining an explicit physical mechanics formulation with embedded hardware implementation and modern foundation-model RL adaptation provides a balanced, high-impact submission pipeline.</w:t>
       </w:r>
     </w:p>
     <w:p>
@@ -1676,7 +1693,7 @@
         <w:t>Fall 2026</w:t>
       </w:r>
       <w:r>
-        <w:t>: Complete Master's core coursework; in-depth literature review on cutting dynamics, impedance control, and contact mechanics; initial sensor bench testing.</w:t>
+        <w:t>: Complete Master's core coursework; in-depth literature review on cutting dynamics, impedance control, contact mechanics, and foundational dexterity frameworks (ADEPT); initial sensor bench testing.</w:t>
       </w:r>
     </w:p>
     <w:p>
@@ -1721,7 +1738,7 @@
           <w:color w:val="4B6B94"/>
           <w:sz w:val="26"/>
         </w:rPr>
-        <w:t>Year 2: System Development, Integration &amp; First Publication (2027 to 2028)</w:t>
+        <w:t>Year 2: System Development, Integration &amp; First Publication (Paper 1) (2027 to 2028)</w:t>
       </w:r>
     </w:p>
     <w:p>
@@ -1751,7 +1768,7 @@
         <w:t>Winter 2027 to 2028</w:t>
       </w:r>
       <w:r>
-        <w:t>: Implement phase-switching impedance control and virtual energy tank passivity architecture; conduct primary cutting trials on tomatoes.</w:t>
+        <w:t>: Implement phase-switching impedance control and traditional RL benchmark policies; conduct primary cutting trials on deformable produce (tomatoes).</w:t>
       </w:r>
     </w:p>
     <w:p>
@@ -1766,7 +1783,16 @@
         <w:t>Spring 2028</w:t>
       </w:r>
       <w:r>
-        <w:t xml:space="preserve">: Prepare and submit initial manuscript to </w:t>
+        <w:t xml:space="preserve">: Prepare and submit </w:t>
+      </w:r>
+      <w:r>
+        <w:rPr>
+          <w:b/>
+        </w:rPr>
+        <w:t>Paper 1</w:t>
+      </w:r>
+      <w:r>
+        <w:t xml:space="preserve"> to </w:t>
       </w:r>
       <w:r>
         <w:rPr>
@@ -1775,7 +1801,16 @@
         <w:t>IEEE RA-L / IROS 2028</w:t>
       </w:r>
       <w:r>
-        <w:t>; integrate visual perception for automated cut trajectory generation.</w:t>
+        <w:t xml:space="preserve"> (</w:t>
+      </w:r>
+      <w:r>
+        <w:rPr>
+          <w:i/>
+        </w:rPr>
+        <w:t>Adaptive Slicing of Deformable Objects via Traditional RL &amp; Phase-Aware Impedance Control</w:t>
+      </w:r>
+      <w:r>
+        <w:t>); integrate visual perception for automated cut trajectory generation.</w:t>
       </w:r>
     </w:p>
     <w:p>
@@ -1790,7 +1825,7 @@
         <w:t>Summer 2028</w:t>
       </w:r>
       <w:r>
-        <w:t>: Refine controller based on initial review feedback; expand vision-force handoff testing.</w:t>
+        <w:t>: Refine controller based on review feedback; set up large-scale GPU simulation in NVIDIA Isaac Lab for foundation model pre-training.</w:t>
       </w:r>
     </w:p>
     <w:p>
@@ -1805,7 +1840,7 @@
           <w:color w:val="4B6B94"/>
           <w:sz w:val="26"/>
         </w:rPr>
-        <w:t>Year 3: Scaling, Multi-Food Generalization &amp; Thesis Defense (2028 to 2029)</w:t>
+        <w:t>Year 3: ADEPT Paradigm Scaling, Multi-Food Generalization &amp; Thesis Defense (Paper 2) (2028 to 2029)</w:t>
       </w:r>
     </w:p>
     <w:p>
@@ -1820,7 +1855,16 @@
         <w:t>Fall 2028</w:t>
       </w:r>
       <w:r>
-        <w:t>: Large-scale multi-food generalization campaign across varying food textures, skin toughness, and blade sharpness levels; long-term durability testing.</w:t>
+        <w:t xml:space="preserve">: Deploy the </w:t>
+      </w:r>
+      <w:r>
+        <w:rPr>
+          <w:b/>
+        </w:rPr>
+        <w:t>ADEPT pre-training and post-training pipeline</w:t>
+      </w:r>
+      <w:r>
+        <w:t xml:space="preserve"> in Isaac Lab; pre-train foundational tool-use priors, apply conservative RL post-training across diverse food geometries, and distill into onboard visuo-tactile students.</w:t>
       </w:r>
     </w:p>
     <w:p>
@@ -1835,13 +1879,31 @@
         <w:t>Winter 2028 to 2029</w:t>
       </w:r>
       <w:r>
-        <w:t>: Manuscript preparation and submission for second milestone paper (</w:t>
+        <w:t xml:space="preserve">: Complete real-world multi-food zero-shot transfer trials; prepare and submit </w:t>
+      </w:r>
+      <w:r>
+        <w:rPr>
+          <w:b/>
+        </w:rPr>
+        <w:t>Paper 2</w:t>
+      </w:r>
+      <w:r>
+        <w:t xml:space="preserve"> to </w:t>
       </w:r>
       <w:r>
         <w:rPr>
           <w:b/>
         </w:rPr>
         <w:t>IEEE ICRA / T-RO 2029</w:t>
+      </w:r>
+      <w:r>
+        <w:t xml:space="preserve"> (</w:t>
+      </w:r>
+      <w:r>
+        <w:rPr>
+          <w:i/>
+        </w:rPr>
+        <w:t>Scaling Deformable Manipulation via Pre-Trained Foundation Dexterity</w:t>
       </w:r>
       <w:r>
         <w:t>).</w:t>
@@ -1859,7 +1921,7 @@
         <w:t>Spring 2029</w:t>
       </w:r>
       <w:r>
-        <w:t>: Final system polish, packaging open-source hardware/software releases, and writing Master's thesis.</w:t>
+        <w:t>: Final system polish, packaging open-source hardware/software releases (compatible with LeRobot / Open X-Embodiment), and writing Master's thesis.</w:t>
       </w:r>
     </w:p>
     <w:p>

</xml_diff>